<commit_message>
Complete Marketplace module with dynamic listings and item details
</commit_message>
<xml_diff>
--- a/docs/SwapSphere_DB_Design.docx
+++ b/docs/SwapSphere_DB_Design.docx
@@ -684,6 +684,7 @@
                 <w:szCs w:val="24"/>
               </w:rPr>
             </w:pPr>
+            <w:proofErr w:type="spellStart"/>
             <w:r>
               <w:rPr>
                 <w:rFonts w:ascii="Times New Roman" w:hAnsi="Times New Roman" w:cs="Times New Roman"/>
@@ -692,6 +693,7 @@
               </w:rPr>
               <w:t>ObjectId</w:t>
             </w:r>
+            <w:proofErr w:type="spellEnd"/>
           </w:p>
         </w:tc>
         <w:tc>
@@ -761,6 +763,7 @@
                 <w:szCs w:val="24"/>
               </w:rPr>
             </w:pPr>
+            <w:proofErr w:type="spellStart"/>
             <w:r>
               <w:rPr>
                 <w:rFonts w:ascii="Times New Roman" w:hAnsi="Times New Roman" w:cs="Times New Roman"/>
@@ -769,6 +772,7 @@
               </w:rPr>
               <w:t>fullName</w:t>
             </w:r>
+            <w:proofErr w:type="spellEnd"/>
           </w:p>
         </w:tc>
         <w:tc>
@@ -1064,6 +1068,7 @@
                 <w:szCs w:val="24"/>
               </w:rPr>
             </w:pPr>
+            <w:proofErr w:type="spellStart"/>
             <w:r>
               <w:rPr>
                 <w:rFonts w:ascii="Times New Roman" w:hAnsi="Times New Roman" w:cs="Times New Roman"/>
@@ -1072,6 +1077,7 @@
               </w:rPr>
               <w:t>googleId</w:t>
             </w:r>
+            <w:proofErr w:type="spellEnd"/>
           </w:p>
         </w:tc>
         <w:tc>
@@ -1165,6 +1171,7 @@
                 <w:szCs w:val="24"/>
               </w:rPr>
             </w:pPr>
+            <w:proofErr w:type="spellStart"/>
             <w:r>
               <w:rPr>
                 <w:rFonts w:ascii="Times New Roman" w:hAnsi="Times New Roman" w:cs="Times New Roman"/>
@@ -1173,6 +1180,7 @@
               </w:rPr>
               <w:t>profilePicture</w:t>
             </w:r>
+            <w:proofErr w:type="spellEnd"/>
           </w:p>
         </w:tc>
         <w:tc>
@@ -1569,6 +1577,7 @@
                 <w:szCs w:val="24"/>
               </w:rPr>
             </w:pPr>
+            <w:proofErr w:type="spellStart"/>
             <w:r>
               <w:rPr>
                 <w:rFonts w:ascii="Times New Roman" w:hAnsi="Times New Roman" w:cs="Times New Roman"/>
@@ -1577,6 +1586,7 @@
               </w:rPr>
               <w:t>totalCompletedExchanges</w:t>
             </w:r>
+            <w:proofErr w:type="spellEnd"/>
           </w:p>
         </w:tc>
         <w:tc>
@@ -1670,6 +1680,7 @@
                 <w:szCs w:val="24"/>
               </w:rPr>
             </w:pPr>
+            <w:proofErr w:type="spellStart"/>
             <w:r>
               <w:rPr>
                 <w:rFonts w:ascii="Times New Roman" w:hAnsi="Times New Roman" w:cs="Times New Roman"/>
@@ -1678,6 +1689,7 @@
               </w:rPr>
               <w:t>averageRating</w:t>
             </w:r>
+            <w:proofErr w:type="spellEnd"/>
           </w:p>
         </w:tc>
         <w:tc>
@@ -1771,6 +1783,7 @@
                 <w:szCs w:val="24"/>
               </w:rPr>
             </w:pPr>
+            <w:proofErr w:type="spellStart"/>
             <w:r>
               <w:rPr>
                 <w:rFonts w:ascii="Times New Roman" w:hAnsi="Times New Roman" w:cs="Times New Roman"/>
@@ -1779,6 +1792,7 @@
               </w:rPr>
               <w:t>exchangeSuccessRate</w:t>
             </w:r>
+            <w:proofErr w:type="spellEnd"/>
           </w:p>
         </w:tc>
         <w:tc>
@@ -2074,6 +2088,7 @@
                 <w:szCs w:val="24"/>
               </w:rPr>
             </w:pPr>
+            <w:proofErr w:type="spellStart"/>
             <w:r>
               <w:rPr>
                 <w:rFonts w:ascii="Times New Roman" w:hAnsi="Times New Roman" w:cs="Times New Roman"/>
@@ -2082,6 +2097,7 @@
               </w:rPr>
               <w:t>createdAt</w:t>
             </w:r>
+            <w:proofErr w:type="spellEnd"/>
           </w:p>
         </w:tc>
         <w:tc>
@@ -2175,6 +2191,7 @@
                 <w:szCs w:val="24"/>
               </w:rPr>
             </w:pPr>
+            <w:proofErr w:type="spellStart"/>
             <w:r>
               <w:rPr>
                 <w:rFonts w:ascii="Times New Roman" w:hAnsi="Times New Roman" w:cs="Times New Roman"/>
@@ -2183,6 +2200,7 @@
               </w:rPr>
               <w:t>updatedAt</w:t>
             </w:r>
+            <w:proofErr w:type="spellEnd"/>
           </w:p>
         </w:tc>
         <w:tc>
@@ -2525,6 +2543,7 @@
                 <w:szCs w:val="24"/>
               </w:rPr>
             </w:pPr>
+            <w:proofErr w:type="spellStart"/>
             <w:r>
               <w:rPr>
                 <w:rFonts w:ascii="Times New Roman" w:hAnsi="Times New Roman" w:cs="Times New Roman"/>
@@ -2533,6 +2552,7 @@
               </w:rPr>
               <w:t>ObjectId</w:t>
             </w:r>
+            <w:proofErr w:type="spellEnd"/>
           </w:p>
         </w:tc>
         <w:tc>
@@ -3012,6 +3032,7 @@
                 <w:szCs w:val="24"/>
               </w:rPr>
             </w:pPr>
+            <w:proofErr w:type="spellStart"/>
             <w:r>
               <w:rPr>
                 <w:rFonts w:ascii="Times New Roman" w:hAnsi="Times New Roman" w:cs="Times New Roman"/>
@@ -3020,6 +3041,7 @@
               </w:rPr>
               <w:t>isActive</w:t>
             </w:r>
+            <w:proofErr w:type="spellEnd"/>
           </w:p>
         </w:tc>
         <w:tc>
@@ -3113,6 +3135,7 @@
                 <w:szCs w:val="24"/>
               </w:rPr>
             </w:pPr>
+            <w:proofErr w:type="spellStart"/>
             <w:r>
               <w:rPr>
                 <w:rFonts w:ascii="Times New Roman" w:hAnsi="Times New Roman" w:cs="Times New Roman"/>
@@ -3121,6 +3144,7 @@
               </w:rPr>
               <w:t>createdAt</w:t>
             </w:r>
+            <w:proofErr w:type="spellEnd"/>
           </w:p>
         </w:tc>
         <w:tc>
@@ -3214,6 +3238,7 @@
                 <w:szCs w:val="24"/>
               </w:rPr>
             </w:pPr>
+            <w:proofErr w:type="spellStart"/>
             <w:r>
               <w:rPr>
                 <w:rFonts w:ascii="Times New Roman" w:hAnsi="Times New Roman" w:cs="Times New Roman"/>
@@ -3222,6 +3247,7 @@
               </w:rPr>
               <w:t>updatedAt</w:t>
             </w:r>
+            <w:proofErr w:type="spellEnd"/>
           </w:p>
         </w:tc>
         <w:tc>
@@ -3630,6 +3656,7 @@
                 <w:szCs w:val="24"/>
               </w:rPr>
             </w:pPr>
+            <w:proofErr w:type="spellStart"/>
             <w:r>
               <w:rPr>
                 <w:rFonts w:ascii="Times New Roman" w:hAnsi="Times New Roman" w:cs="Times New Roman"/>
@@ -3638,6 +3665,7 @@
               </w:rPr>
               <w:t>ObjectId</w:t>
             </w:r>
+            <w:proofErr w:type="spellEnd"/>
           </w:p>
         </w:tc>
         <w:tc>
@@ -3707,6 +3735,7 @@
                 <w:szCs w:val="24"/>
               </w:rPr>
             </w:pPr>
+            <w:proofErr w:type="spellStart"/>
             <w:r>
               <w:rPr>
                 <w:rFonts w:ascii="Times New Roman" w:hAnsi="Times New Roman" w:cs="Times New Roman"/>
@@ -3715,29 +3744,40 @@
               </w:rPr>
               <w:t>ownerId</w:t>
             </w:r>
-          </w:p>
-        </w:tc>
-        <w:tc>
-          <w:tcPr>
-            <w:tcW w:w="0" w:type="auto"/>
-            <w:vAlign w:val="center"/>
-            <w:hideMark/>
-          </w:tcPr>
-          <w:p>
-            <w:pPr>
-              <w:rPr>
-                <w:rFonts w:ascii="Times New Roman" w:hAnsi="Times New Roman" w:cs="Times New Roman"/>
-                <w:sz w:val="24"/>
-                <w:szCs w:val="24"/>
-              </w:rPr>
-            </w:pPr>
-            <w:r>
-              <w:rPr>
-                <w:rFonts w:ascii="Times New Roman" w:hAnsi="Times New Roman" w:cs="Times New Roman"/>
-                <w:sz w:val="24"/>
-                <w:szCs w:val="24"/>
-              </w:rPr>
-              <w:t>ObjectId (User)</w:t>
+            <w:proofErr w:type="spellEnd"/>
+          </w:p>
+        </w:tc>
+        <w:tc>
+          <w:tcPr>
+            <w:tcW w:w="0" w:type="auto"/>
+            <w:vAlign w:val="center"/>
+            <w:hideMark/>
+          </w:tcPr>
+          <w:p>
+            <w:pPr>
+              <w:rPr>
+                <w:rFonts w:ascii="Times New Roman" w:hAnsi="Times New Roman" w:cs="Times New Roman"/>
+                <w:sz w:val="24"/>
+                <w:szCs w:val="24"/>
+              </w:rPr>
+            </w:pPr>
+            <w:proofErr w:type="spellStart"/>
+            <w:r>
+              <w:rPr>
+                <w:rFonts w:ascii="Times New Roman" w:hAnsi="Times New Roman" w:cs="Times New Roman"/>
+                <w:sz w:val="24"/>
+                <w:szCs w:val="24"/>
+              </w:rPr>
+              <w:t>ObjectId</w:t>
+            </w:r>
+            <w:proofErr w:type="spellEnd"/>
+            <w:r>
+              <w:rPr>
+                <w:rFonts w:ascii="Times New Roman" w:hAnsi="Times New Roman" w:cs="Times New Roman"/>
+                <w:sz w:val="24"/>
+                <w:szCs w:val="24"/>
+              </w:rPr>
+              <w:t xml:space="preserve"> (User)</w:t>
             </w:r>
           </w:p>
         </w:tc>
@@ -4010,6 +4050,7 @@
                 <w:szCs w:val="24"/>
               </w:rPr>
             </w:pPr>
+            <w:proofErr w:type="spellStart"/>
             <w:r>
               <w:rPr>
                 <w:rFonts w:ascii="Times New Roman" w:hAnsi="Times New Roman" w:cs="Times New Roman"/>
@@ -4018,22 +4059,24 @@
               </w:rPr>
               <w:t>categoryId</w:t>
             </w:r>
-          </w:p>
-        </w:tc>
-        <w:tc>
-          <w:tcPr>
-            <w:tcW w:w="0" w:type="auto"/>
-            <w:vAlign w:val="center"/>
-            <w:hideMark/>
-          </w:tcPr>
-          <w:p>
-            <w:pPr>
-              <w:rPr>
-                <w:rFonts w:ascii="Times New Roman" w:hAnsi="Times New Roman" w:cs="Times New Roman"/>
-                <w:sz w:val="24"/>
-                <w:szCs w:val="24"/>
-              </w:rPr>
-            </w:pPr>
+            <w:proofErr w:type="spellEnd"/>
+          </w:p>
+        </w:tc>
+        <w:tc>
+          <w:tcPr>
+            <w:tcW w:w="0" w:type="auto"/>
+            <w:vAlign w:val="center"/>
+            <w:hideMark/>
+          </w:tcPr>
+          <w:p>
+            <w:pPr>
+              <w:rPr>
+                <w:rFonts w:ascii="Times New Roman" w:hAnsi="Times New Roman" w:cs="Times New Roman"/>
+                <w:sz w:val="24"/>
+                <w:szCs w:val="24"/>
+              </w:rPr>
+            </w:pPr>
+            <w:proofErr w:type="spellStart"/>
             <w:r>
               <w:rPr>
                 <w:rFonts w:ascii="Times New Roman" w:hAnsi="Times New Roman" w:cs="Times New Roman"/>
@@ -4042,6 +4085,7 @@
               </w:rPr>
               <w:t>ObjectId</w:t>
             </w:r>
+            <w:proofErr w:type="spellEnd"/>
           </w:p>
         </w:tc>
         <w:tc>
@@ -4101,70 +4145,67 @@
           <w:tcPr>
             <w:tcW w:w="0" w:type="auto"/>
             <w:vAlign w:val="center"/>
-            <w:hideMark/>
-          </w:tcPr>
-          <w:p>
-            <w:pPr>
-              <w:rPr>
-                <w:rFonts w:ascii="Times New Roman" w:hAnsi="Times New Roman" w:cs="Times New Roman"/>
-                <w:sz w:val="24"/>
-                <w:szCs w:val="24"/>
-              </w:rPr>
-            </w:pPr>
-            <w:r>
-              <w:rPr>
-                <w:rFonts w:ascii="Times New Roman" w:hAnsi="Times New Roman" w:cs="Times New Roman"/>
-                <w:sz w:val="24"/>
-                <w:szCs w:val="24"/>
-              </w:rPr>
-              <w:t>condition</w:t>
-            </w:r>
-          </w:p>
-        </w:tc>
-        <w:tc>
-          <w:tcPr>
-            <w:tcW w:w="0" w:type="auto"/>
-            <w:vAlign w:val="center"/>
-            <w:hideMark/>
-          </w:tcPr>
-          <w:p>
-            <w:pPr>
-              <w:rPr>
-                <w:rFonts w:ascii="Times New Roman" w:hAnsi="Times New Roman" w:cs="Times New Roman"/>
-                <w:sz w:val="24"/>
-                <w:szCs w:val="24"/>
-              </w:rPr>
-            </w:pPr>
-            <w:r>
-              <w:rPr>
-                <w:rFonts w:ascii="Times New Roman" w:hAnsi="Times New Roman" w:cs="Times New Roman"/>
-                <w:sz w:val="24"/>
-                <w:szCs w:val="24"/>
-              </w:rPr>
-              <w:t>Enum</w:t>
-            </w:r>
-          </w:p>
-        </w:tc>
-        <w:tc>
-          <w:tcPr>
-            <w:tcW w:w="0" w:type="auto"/>
-            <w:vAlign w:val="center"/>
-            <w:hideMark/>
-          </w:tcPr>
-          <w:p>
-            <w:pPr>
-              <w:rPr>
-                <w:rFonts w:ascii="Times New Roman" w:hAnsi="Times New Roman" w:cs="Times New Roman"/>
-                <w:sz w:val="24"/>
-                <w:szCs w:val="24"/>
-              </w:rPr>
-            </w:pPr>
-            <w:r>
+          </w:tcPr>
+          <w:p>
+            <w:pPr>
+              <w:rPr>
+                <w:rFonts w:ascii="Times New Roman" w:hAnsi="Times New Roman" w:cs="Times New Roman"/>
+                <w:sz w:val="24"/>
+                <w:szCs w:val="24"/>
+              </w:rPr>
+            </w:pPr>
+            <w:r>
+              <w:rPr>
+                <w:rFonts w:ascii="Times New Roman" w:hAnsi="Times New Roman" w:cs="Times New Roman"/>
+                <w:sz w:val="24"/>
+                <w:szCs w:val="24"/>
+              </w:rPr>
+              <w:t>subcategory</w:t>
+            </w:r>
+          </w:p>
+        </w:tc>
+        <w:tc>
+          <w:tcPr>
+            <w:tcW w:w="0" w:type="auto"/>
+            <w:vAlign w:val="center"/>
+          </w:tcPr>
+          <w:p>
+            <w:pPr>
+              <w:rPr>
+                <w:rFonts w:ascii="Times New Roman" w:hAnsi="Times New Roman" w:cs="Times New Roman"/>
+                <w:sz w:val="24"/>
+                <w:szCs w:val="24"/>
+              </w:rPr>
+            </w:pPr>
+            <w:r>
+              <w:rPr>
+                <w:rFonts w:ascii="Times New Roman" w:hAnsi="Times New Roman" w:cs="Times New Roman"/>
+                <w:sz w:val="24"/>
+                <w:szCs w:val="24"/>
+              </w:rPr>
+              <w:t>String</w:t>
+            </w:r>
+          </w:p>
+        </w:tc>
+        <w:tc>
+          <w:tcPr>
+            <w:tcW w:w="0" w:type="auto"/>
+            <w:vAlign w:val="center"/>
+          </w:tcPr>
+          <w:p>
+            <w:pPr>
               <w:rPr>
                 <w:rFonts w:ascii="Segoe UI Emoji" w:hAnsi="Segoe UI Emoji" w:cs="Segoe UI Emoji"/>
                 <w:sz w:val="24"/>
                 <w:szCs w:val="24"/>
               </w:rPr>
+            </w:pPr>
+            <w:r>
+              <w:rPr>
+                <w:rFonts w:ascii="Segoe UI Emoji" w:hAnsi="Segoe UI Emoji" w:cs="Segoe UI Emoji"/>
+                <w:sz w:val="24"/>
+                <w:szCs w:val="24"/>
+              </w:rPr>
               <w:t>✅</w:t>
             </w:r>
           </w:p>
@@ -4173,23 +4214,22 @@
           <w:tcPr>
             <w:tcW w:w="0" w:type="auto"/>
             <w:vAlign w:val="center"/>
-            <w:hideMark/>
-          </w:tcPr>
-          <w:p>
-            <w:pPr>
-              <w:rPr>
-                <w:rFonts w:ascii="Times New Roman" w:hAnsi="Times New Roman" w:cs="Times New Roman"/>
-                <w:sz w:val="24"/>
-                <w:szCs w:val="24"/>
-              </w:rPr>
-            </w:pPr>
-            <w:r>
-              <w:rPr>
-                <w:rFonts w:ascii="Times New Roman" w:hAnsi="Times New Roman" w:cs="Times New Roman"/>
-                <w:sz w:val="24"/>
-                <w:szCs w:val="24"/>
-              </w:rPr>
-              <w:t>NEW, LIKE_NEW, GOOD, FAIR, POOR</w:t>
+          </w:tcPr>
+          <w:p>
+            <w:pPr>
+              <w:rPr>
+                <w:rFonts w:ascii="Times New Roman" w:hAnsi="Times New Roman" w:cs="Times New Roman"/>
+                <w:sz w:val="24"/>
+                <w:szCs w:val="24"/>
+              </w:rPr>
+            </w:pPr>
+            <w:r>
+              <w:rPr>
+                <w:rFonts w:ascii="Times New Roman" w:hAnsi="Times New Roman" w:cs="Times New Roman"/>
+                <w:sz w:val="24"/>
+                <w:szCs w:val="24"/>
+              </w:rPr>
+              <w:t>Subcategory the item belongs to</w:t>
             </w:r>
           </w:p>
         </w:tc>
@@ -4218,31 +4258,31 @@
                 <w:sz w:val="24"/>
                 <w:szCs w:val="24"/>
               </w:rPr>
-              <w:t>images</w:t>
-            </w:r>
-          </w:p>
-        </w:tc>
-        <w:tc>
-          <w:tcPr>
-            <w:tcW w:w="0" w:type="auto"/>
-            <w:vAlign w:val="center"/>
-            <w:hideMark/>
-          </w:tcPr>
-          <w:p>
-            <w:pPr>
-              <w:rPr>
-                <w:rFonts w:ascii="Times New Roman" w:hAnsi="Times New Roman" w:cs="Times New Roman"/>
-                <w:sz w:val="24"/>
-                <w:szCs w:val="24"/>
-              </w:rPr>
-            </w:pPr>
-            <w:r>
-              <w:rPr>
-                <w:rFonts w:ascii="Times New Roman" w:hAnsi="Times New Roman" w:cs="Times New Roman"/>
-                <w:sz w:val="24"/>
-                <w:szCs w:val="24"/>
-              </w:rPr>
-              <w:t>Array&lt;String&gt;</w:t>
+              <w:t>condition</w:t>
+            </w:r>
+          </w:p>
+        </w:tc>
+        <w:tc>
+          <w:tcPr>
+            <w:tcW w:w="0" w:type="auto"/>
+            <w:vAlign w:val="center"/>
+            <w:hideMark/>
+          </w:tcPr>
+          <w:p>
+            <w:pPr>
+              <w:rPr>
+                <w:rFonts w:ascii="Times New Roman" w:hAnsi="Times New Roman" w:cs="Times New Roman"/>
+                <w:sz w:val="24"/>
+                <w:szCs w:val="24"/>
+              </w:rPr>
+            </w:pPr>
+            <w:r>
+              <w:rPr>
+                <w:rFonts w:ascii="Times New Roman" w:hAnsi="Times New Roman" w:cs="Times New Roman"/>
+                <w:sz w:val="24"/>
+                <w:szCs w:val="24"/>
+              </w:rPr>
+              <w:t>Enum</w:t>
             </w:r>
           </w:p>
         </w:tc>
@@ -4290,7 +4330,31 @@
                 <w:sz w:val="24"/>
                 <w:szCs w:val="24"/>
               </w:rPr>
-              <w:t>URLs/paths of uploaded item images</w:t>
+              <w:t xml:space="preserve">LIKE_NEW, </w:t>
+            </w:r>
+            <w:r>
+              <w:rPr>
+                <w:rFonts w:ascii="Times New Roman" w:hAnsi="Times New Roman" w:cs="Times New Roman"/>
+                <w:sz w:val="24"/>
+                <w:szCs w:val="24"/>
+              </w:rPr>
+              <w:t>EXCELLENT</w:t>
+            </w:r>
+            <w:r>
+              <w:rPr>
+                <w:rFonts w:ascii="Times New Roman" w:hAnsi="Times New Roman" w:cs="Times New Roman"/>
+                <w:sz w:val="24"/>
+                <w:szCs w:val="24"/>
+              </w:rPr>
+              <w:t xml:space="preserve">, </w:t>
+            </w:r>
+            <w:r>
+              <w:rPr>
+                <w:rFonts w:ascii="Times New Roman" w:hAnsi="Times New Roman" w:cs="Times New Roman"/>
+                <w:sz w:val="24"/>
+                <w:szCs w:val="24"/>
+              </w:rPr>
+              <w:t>GOOD, FAIR, POOR</w:t>
             </w:r>
           </w:p>
         </w:tc>
@@ -4319,7 +4383,7 @@
                 <w:sz w:val="24"/>
                 <w:szCs w:val="24"/>
               </w:rPr>
-              <w:t>videos</w:t>
+              <w:t>images</w:t>
             </w:r>
           </w:p>
         </w:tc>
@@ -4367,31 +4431,31 @@
                 <w:sz w:val="24"/>
                 <w:szCs w:val="24"/>
               </w:rPr>
-              <w:t>❌</w:t>
-            </w:r>
-          </w:p>
-        </w:tc>
-        <w:tc>
-          <w:tcPr>
-            <w:tcW w:w="0" w:type="auto"/>
-            <w:vAlign w:val="center"/>
-            <w:hideMark/>
-          </w:tcPr>
-          <w:p>
-            <w:pPr>
-              <w:rPr>
-                <w:rFonts w:ascii="Times New Roman" w:hAnsi="Times New Roman" w:cs="Times New Roman"/>
-                <w:sz w:val="24"/>
-                <w:szCs w:val="24"/>
-              </w:rPr>
-            </w:pPr>
-            <w:r>
-              <w:rPr>
-                <w:rFonts w:ascii="Times New Roman" w:hAnsi="Times New Roman" w:cs="Times New Roman"/>
-                <w:sz w:val="24"/>
-                <w:szCs w:val="24"/>
-              </w:rPr>
-              <w:t>URLs/paths of uploaded item videos</w:t>
+              <w:t>✅</w:t>
+            </w:r>
+          </w:p>
+        </w:tc>
+        <w:tc>
+          <w:tcPr>
+            <w:tcW w:w="0" w:type="auto"/>
+            <w:vAlign w:val="center"/>
+            <w:hideMark/>
+          </w:tcPr>
+          <w:p>
+            <w:pPr>
+              <w:rPr>
+                <w:rFonts w:ascii="Times New Roman" w:hAnsi="Times New Roman" w:cs="Times New Roman"/>
+                <w:sz w:val="24"/>
+                <w:szCs w:val="24"/>
+              </w:rPr>
+            </w:pPr>
+            <w:r>
+              <w:rPr>
+                <w:rFonts w:ascii="Times New Roman" w:hAnsi="Times New Roman" w:cs="Times New Roman"/>
+                <w:sz w:val="24"/>
+                <w:szCs w:val="24"/>
+              </w:rPr>
+              <w:t>URLs/paths of uploaded item images</w:t>
             </w:r>
           </w:p>
         </w:tc>
@@ -4420,31 +4484,31 @@
                 <w:sz w:val="24"/>
                 <w:szCs w:val="24"/>
               </w:rPr>
-              <w:t>exchangePreferences</w:t>
-            </w:r>
-          </w:p>
-        </w:tc>
-        <w:tc>
-          <w:tcPr>
-            <w:tcW w:w="0" w:type="auto"/>
-            <w:vAlign w:val="center"/>
-            <w:hideMark/>
-          </w:tcPr>
-          <w:p>
-            <w:pPr>
-              <w:rPr>
-                <w:rFonts w:ascii="Times New Roman" w:hAnsi="Times New Roman" w:cs="Times New Roman"/>
-                <w:sz w:val="24"/>
-                <w:szCs w:val="24"/>
-              </w:rPr>
-            </w:pPr>
-            <w:r>
-              <w:rPr>
-                <w:rFonts w:ascii="Times New Roman" w:hAnsi="Times New Roman" w:cs="Times New Roman"/>
-                <w:sz w:val="24"/>
-                <w:szCs w:val="24"/>
-              </w:rPr>
-              <w:t>Array&lt;Object&gt;</w:t>
+              <w:t>videos</w:t>
+            </w:r>
+          </w:p>
+        </w:tc>
+        <w:tc>
+          <w:tcPr>
+            <w:tcW w:w="0" w:type="auto"/>
+            <w:vAlign w:val="center"/>
+            <w:hideMark/>
+          </w:tcPr>
+          <w:p>
+            <w:pPr>
+              <w:rPr>
+                <w:rFonts w:ascii="Times New Roman" w:hAnsi="Times New Roman" w:cs="Times New Roman"/>
+                <w:sz w:val="24"/>
+                <w:szCs w:val="24"/>
+              </w:rPr>
+            </w:pPr>
+            <w:r>
+              <w:rPr>
+                <w:rFonts w:ascii="Times New Roman" w:hAnsi="Times New Roman" w:cs="Times New Roman"/>
+                <w:sz w:val="24"/>
+                <w:szCs w:val="24"/>
+              </w:rPr>
+              <w:t>Array&lt;String&gt;</w:t>
             </w:r>
           </w:p>
         </w:tc>
@@ -4468,31 +4532,31 @@
                 <w:sz w:val="24"/>
                 <w:szCs w:val="24"/>
               </w:rPr>
-              <w:t>✅</w:t>
-            </w:r>
-          </w:p>
-        </w:tc>
-        <w:tc>
-          <w:tcPr>
-            <w:tcW w:w="0" w:type="auto"/>
-            <w:vAlign w:val="center"/>
-            <w:hideMark/>
-          </w:tcPr>
-          <w:p>
-            <w:pPr>
-              <w:rPr>
-                <w:rFonts w:ascii="Times New Roman" w:hAnsi="Times New Roman" w:cs="Times New Roman"/>
-                <w:sz w:val="24"/>
-                <w:szCs w:val="24"/>
-              </w:rPr>
-            </w:pPr>
-            <w:r>
-              <w:rPr>
-                <w:rFonts w:ascii="Times New Roman" w:hAnsi="Times New Roman" w:cs="Times New Roman"/>
-                <w:sz w:val="24"/>
-                <w:szCs w:val="24"/>
-              </w:rPr>
-              <w:t>Ordered list of preferred exchange categories or subcategories arranged by priority</w:t>
+              <w:t>❌</w:t>
+            </w:r>
+          </w:p>
+        </w:tc>
+        <w:tc>
+          <w:tcPr>
+            <w:tcW w:w="0" w:type="auto"/>
+            <w:vAlign w:val="center"/>
+            <w:hideMark/>
+          </w:tcPr>
+          <w:p>
+            <w:pPr>
+              <w:rPr>
+                <w:rFonts w:ascii="Times New Roman" w:hAnsi="Times New Roman" w:cs="Times New Roman"/>
+                <w:sz w:val="24"/>
+                <w:szCs w:val="24"/>
+              </w:rPr>
+            </w:pPr>
+            <w:r>
+              <w:rPr>
+                <w:rFonts w:ascii="Times New Roman" w:hAnsi="Times New Roman" w:cs="Times New Roman"/>
+                <w:sz w:val="24"/>
+                <w:szCs w:val="24"/>
+              </w:rPr>
+              <w:t>URLs/paths of uploaded item videos</w:t>
             </w:r>
           </w:p>
         </w:tc>
@@ -4515,37 +4579,39 @@
                 <w:szCs w:val="24"/>
               </w:rPr>
             </w:pPr>
-            <w:r>
-              <w:rPr>
-                <w:rFonts w:ascii="Times New Roman" w:hAnsi="Times New Roman" w:cs="Times New Roman"/>
-                <w:sz w:val="24"/>
-                <w:szCs w:val="24"/>
-              </w:rPr>
-              <w:t>status</w:t>
-            </w:r>
-          </w:p>
-        </w:tc>
-        <w:tc>
-          <w:tcPr>
-            <w:tcW w:w="0" w:type="auto"/>
-            <w:vAlign w:val="center"/>
-            <w:hideMark/>
-          </w:tcPr>
-          <w:p>
-            <w:pPr>
-              <w:rPr>
-                <w:rFonts w:ascii="Times New Roman" w:hAnsi="Times New Roman" w:cs="Times New Roman"/>
-                <w:sz w:val="24"/>
-                <w:szCs w:val="24"/>
-              </w:rPr>
-            </w:pPr>
-            <w:r>
-              <w:rPr>
-                <w:rFonts w:ascii="Times New Roman" w:hAnsi="Times New Roman" w:cs="Times New Roman"/>
-                <w:sz w:val="24"/>
-                <w:szCs w:val="24"/>
-              </w:rPr>
-              <w:t>Enum</w:t>
+            <w:proofErr w:type="spellStart"/>
+            <w:r>
+              <w:rPr>
+                <w:rFonts w:ascii="Times New Roman" w:hAnsi="Times New Roman" w:cs="Times New Roman"/>
+                <w:sz w:val="24"/>
+                <w:szCs w:val="24"/>
+              </w:rPr>
+              <w:t>exchangePreferences</w:t>
+            </w:r>
+            <w:proofErr w:type="spellEnd"/>
+          </w:p>
+        </w:tc>
+        <w:tc>
+          <w:tcPr>
+            <w:tcW w:w="0" w:type="auto"/>
+            <w:vAlign w:val="center"/>
+            <w:hideMark/>
+          </w:tcPr>
+          <w:p>
+            <w:pPr>
+              <w:rPr>
+                <w:rFonts w:ascii="Times New Roman" w:hAnsi="Times New Roman" w:cs="Times New Roman"/>
+                <w:sz w:val="24"/>
+                <w:szCs w:val="24"/>
+              </w:rPr>
+            </w:pPr>
+            <w:r>
+              <w:rPr>
+                <w:rFonts w:ascii="Times New Roman" w:hAnsi="Times New Roman" w:cs="Times New Roman"/>
+                <w:sz w:val="24"/>
+                <w:szCs w:val="24"/>
+              </w:rPr>
+              <w:t>Array&lt;Object&gt;</w:t>
             </w:r>
           </w:p>
         </w:tc>
@@ -4593,7 +4659,7 @@
                 <w:sz w:val="24"/>
                 <w:szCs w:val="24"/>
               </w:rPr>
-              <w:t>AVAILABLE, PENDING, EXCHANGED, REMOVED</w:t>
+              <w:t>Ordered list of preferred exchange categories or subcategories arranged by priority</w:t>
             </w:r>
           </w:p>
         </w:tc>
@@ -4622,31 +4688,31 @@
                 <w:sz w:val="24"/>
                 <w:szCs w:val="24"/>
               </w:rPr>
-              <w:t>viewCount</w:t>
-            </w:r>
-          </w:p>
-        </w:tc>
-        <w:tc>
-          <w:tcPr>
-            <w:tcW w:w="0" w:type="auto"/>
-            <w:vAlign w:val="center"/>
-            <w:hideMark/>
-          </w:tcPr>
-          <w:p>
-            <w:pPr>
-              <w:rPr>
-                <w:rFonts w:ascii="Times New Roman" w:hAnsi="Times New Roman" w:cs="Times New Roman"/>
-                <w:sz w:val="24"/>
-                <w:szCs w:val="24"/>
-              </w:rPr>
-            </w:pPr>
-            <w:r>
-              <w:rPr>
-                <w:rFonts w:ascii="Times New Roman" w:hAnsi="Times New Roman" w:cs="Times New Roman"/>
-                <w:sz w:val="24"/>
-                <w:szCs w:val="24"/>
-              </w:rPr>
-              <w:t>Number</w:t>
+              <w:t>status</w:t>
+            </w:r>
+          </w:p>
+        </w:tc>
+        <w:tc>
+          <w:tcPr>
+            <w:tcW w:w="0" w:type="auto"/>
+            <w:vAlign w:val="center"/>
+            <w:hideMark/>
+          </w:tcPr>
+          <w:p>
+            <w:pPr>
+              <w:rPr>
+                <w:rFonts w:ascii="Times New Roman" w:hAnsi="Times New Roman" w:cs="Times New Roman"/>
+                <w:sz w:val="24"/>
+                <w:szCs w:val="24"/>
+              </w:rPr>
+            </w:pPr>
+            <w:r>
+              <w:rPr>
+                <w:rFonts w:ascii="Times New Roman" w:hAnsi="Times New Roman" w:cs="Times New Roman"/>
+                <w:sz w:val="24"/>
+                <w:szCs w:val="24"/>
+              </w:rPr>
+              <w:t>Enum</w:t>
             </w:r>
           </w:p>
         </w:tc>
@@ -4670,31 +4736,31 @@
                 <w:sz w:val="24"/>
                 <w:szCs w:val="24"/>
               </w:rPr>
-              <w:t>❌</w:t>
-            </w:r>
-          </w:p>
-        </w:tc>
-        <w:tc>
-          <w:tcPr>
-            <w:tcW w:w="0" w:type="auto"/>
-            <w:vAlign w:val="center"/>
-            <w:hideMark/>
-          </w:tcPr>
-          <w:p>
-            <w:pPr>
-              <w:rPr>
-                <w:rFonts w:ascii="Times New Roman" w:hAnsi="Times New Roman" w:cs="Times New Roman"/>
-                <w:sz w:val="24"/>
-                <w:szCs w:val="24"/>
-              </w:rPr>
-            </w:pPr>
-            <w:r>
-              <w:rPr>
-                <w:rFonts w:ascii="Times New Roman" w:hAnsi="Times New Roman" w:cs="Times New Roman"/>
-                <w:sz w:val="24"/>
-                <w:szCs w:val="24"/>
-              </w:rPr>
-              <w:t>Number of times the listing has been viewed</w:t>
+              <w:t>✅</w:t>
+            </w:r>
+          </w:p>
+        </w:tc>
+        <w:tc>
+          <w:tcPr>
+            <w:tcW w:w="0" w:type="auto"/>
+            <w:vAlign w:val="center"/>
+            <w:hideMark/>
+          </w:tcPr>
+          <w:p>
+            <w:pPr>
+              <w:rPr>
+                <w:rFonts w:ascii="Times New Roman" w:hAnsi="Times New Roman" w:cs="Times New Roman"/>
+                <w:sz w:val="24"/>
+                <w:szCs w:val="24"/>
+              </w:rPr>
+            </w:pPr>
+            <w:r>
+              <w:rPr>
+                <w:rFonts w:ascii="Times New Roman" w:hAnsi="Times New Roman" w:cs="Times New Roman"/>
+                <w:sz w:val="24"/>
+                <w:szCs w:val="24"/>
+              </w:rPr>
+              <w:t>AVAILABLE, PENDING, EXCHANGED, REMOVED</w:t>
             </w:r>
           </w:p>
         </w:tc>
@@ -4717,14 +4783,16 @@
                 <w:szCs w:val="24"/>
               </w:rPr>
             </w:pPr>
-            <w:r>
-              <w:rPr>
-                <w:rFonts w:ascii="Times New Roman" w:hAnsi="Times New Roman" w:cs="Times New Roman"/>
-                <w:sz w:val="24"/>
-                <w:szCs w:val="24"/>
-              </w:rPr>
-              <w:t>favoriteCount</w:t>
-            </w:r>
+            <w:proofErr w:type="spellStart"/>
+            <w:r>
+              <w:rPr>
+                <w:rFonts w:ascii="Times New Roman" w:hAnsi="Times New Roman" w:cs="Times New Roman"/>
+                <w:sz w:val="24"/>
+                <w:szCs w:val="24"/>
+              </w:rPr>
+              <w:t>viewCount</w:t>
+            </w:r>
+            <w:proofErr w:type="spellEnd"/>
           </w:p>
         </w:tc>
         <w:tc>
@@ -4795,7 +4863,7 @@
                 <w:sz w:val="24"/>
                 <w:szCs w:val="24"/>
               </w:rPr>
-              <w:t>Number of users who bookmarked the listing</w:t>
+              <w:t>Number of times the listing has been viewed</w:t>
             </w:r>
           </w:p>
         </w:tc>
@@ -4818,14 +4886,16 @@
                 <w:szCs w:val="24"/>
               </w:rPr>
             </w:pPr>
-            <w:r>
-              <w:rPr>
-                <w:rFonts w:ascii="Times New Roman" w:hAnsi="Times New Roman" w:cs="Times New Roman"/>
-                <w:sz w:val="24"/>
-                <w:szCs w:val="24"/>
-              </w:rPr>
-              <w:t>exchangeRequestCount</w:t>
-            </w:r>
+            <w:proofErr w:type="spellStart"/>
+            <w:r>
+              <w:rPr>
+                <w:rFonts w:ascii="Times New Roman" w:hAnsi="Times New Roman" w:cs="Times New Roman"/>
+                <w:sz w:val="24"/>
+                <w:szCs w:val="24"/>
+              </w:rPr>
+              <w:t>favoriteCount</w:t>
+            </w:r>
+            <w:proofErr w:type="spellEnd"/>
           </w:p>
         </w:tc>
         <w:tc>
@@ -4896,7 +4966,7 @@
                 <w:sz w:val="24"/>
                 <w:szCs w:val="24"/>
               </w:rPr>
-              <w:t>Total exchange requests received</w:t>
+              <w:t>Number of users who bookmarked the listing</w:t>
             </w:r>
           </w:p>
         </w:tc>
@@ -4919,37 +4989,39 @@
                 <w:szCs w:val="24"/>
               </w:rPr>
             </w:pPr>
-            <w:r>
-              <w:rPr>
-                <w:rFonts w:ascii="Times New Roman" w:hAnsi="Times New Roman" w:cs="Times New Roman"/>
-                <w:sz w:val="24"/>
-                <w:szCs w:val="24"/>
-              </w:rPr>
-              <w:t>createdAt</w:t>
-            </w:r>
-          </w:p>
-        </w:tc>
-        <w:tc>
-          <w:tcPr>
-            <w:tcW w:w="0" w:type="auto"/>
-            <w:vAlign w:val="center"/>
-            <w:hideMark/>
-          </w:tcPr>
-          <w:p>
-            <w:pPr>
-              <w:rPr>
-                <w:rFonts w:ascii="Times New Roman" w:hAnsi="Times New Roman" w:cs="Times New Roman"/>
-                <w:sz w:val="24"/>
-                <w:szCs w:val="24"/>
-              </w:rPr>
-            </w:pPr>
-            <w:r>
-              <w:rPr>
-                <w:rFonts w:ascii="Times New Roman" w:hAnsi="Times New Roman" w:cs="Times New Roman"/>
-                <w:sz w:val="24"/>
-                <w:szCs w:val="24"/>
-              </w:rPr>
-              <w:t>Date</w:t>
+            <w:proofErr w:type="spellStart"/>
+            <w:r>
+              <w:rPr>
+                <w:rFonts w:ascii="Times New Roman" w:hAnsi="Times New Roman" w:cs="Times New Roman"/>
+                <w:sz w:val="24"/>
+                <w:szCs w:val="24"/>
+              </w:rPr>
+              <w:t>exchangeRequestCount</w:t>
+            </w:r>
+            <w:proofErr w:type="spellEnd"/>
+          </w:p>
+        </w:tc>
+        <w:tc>
+          <w:tcPr>
+            <w:tcW w:w="0" w:type="auto"/>
+            <w:vAlign w:val="center"/>
+            <w:hideMark/>
+          </w:tcPr>
+          <w:p>
+            <w:pPr>
+              <w:rPr>
+                <w:rFonts w:ascii="Times New Roman" w:hAnsi="Times New Roman" w:cs="Times New Roman"/>
+                <w:sz w:val="24"/>
+                <w:szCs w:val="24"/>
+              </w:rPr>
+            </w:pPr>
+            <w:r>
+              <w:rPr>
+                <w:rFonts w:ascii="Times New Roman" w:hAnsi="Times New Roman" w:cs="Times New Roman"/>
+                <w:sz w:val="24"/>
+                <w:szCs w:val="24"/>
+              </w:rPr>
+              <w:t>Number</w:t>
             </w:r>
           </w:p>
         </w:tc>
@@ -4973,31 +5045,31 @@
                 <w:sz w:val="24"/>
                 <w:szCs w:val="24"/>
               </w:rPr>
-              <w:t>✅</w:t>
-            </w:r>
-          </w:p>
-        </w:tc>
-        <w:tc>
-          <w:tcPr>
-            <w:tcW w:w="0" w:type="auto"/>
-            <w:vAlign w:val="center"/>
-            <w:hideMark/>
-          </w:tcPr>
-          <w:p>
-            <w:pPr>
-              <w:rPr>
-                <w:rFonts w:ascii="Times New Roman" w:hAnsi="Times New Roman" w:cs="Times New Roman"/>
-                <w:sz w:val="24"/>
-                <w:szCs w:val="24"/>
-              </w:rPr>
-            </w:pPr>
-            <w:r>
-              <w:rPr>
-                <w:rFonts w:ascii="Times New Roman" w:hAnsi="Times New Roman" w:cs="Times New Roman"/>
-                <w:sz w:val="24"/>
-                <w:szCs w:val="24"/>
-              </w:rPr>
-              <w:t>Listing creation date</w:t>
+              <w:t>❌</w:t>
+            </w:r>
+          </w:p>
+        </w:tc>
+        <w:tc>
+          <w:tcPr>
+            <w:tcW w:w="0" w:type="auto"/>
+            <w:vAlign w:val="center"/>
+            <w:hideMark/>
+          </w:tcPr>
+          <w:p>
+            <w:pPr>
+              <w:rPr>
+                <w:rFonts w:ascii="Times New Roman" w:hAnsi="Times New Roman" w:cs="Times New Roman"/>
+                <w:sz w:val="24"/>
+                <w:szCs w:val="24"/>
+              </w:rPr>
+            </w:pPr>
+            <w:r>
+              <w:rPr>
+                <w:rFonts w:ascii="Times New Roman" w:hAnsi="Times New Roman" w:cs="Times New Roman"/>
+                <w:sz w:val="24"/>
+                <w:szCs w:val="24"/>
+              </w:rPr>
+              <w:t>Total exchange requests received</w:t>
             </w:r>
           </w:p>
         </w:tc>
@@ -5020,6 +5092,110 @@
                 <w:szCs w:val="24"/>
               </w:rPr>
             </w:pPr>
+            <w:proofErr w:type="spellStart"/>
+            <w:r>
+              <w:rPr>
+                <w:rFonts w:ascii="Times New Roman" w:hAnsi="Times New Roman" w:cs="Times New Roman"/>
+                <w:sz w:val="24"/>
+                <w:szCs w:val="24"/>
+              </w:rPr>
+              <w:t>createdAt</w:t>
+            </w:r>
+            <w:proofErr w:type="spellEnd"/>
+          </w:p>
+        </w:tc>
+        <w:tc>
+          <w:tcPr>
+            <w:tcW w:w="0" w:type="auto"/>
+            <w:vAlign w:val="center"/>
+            <w:hideMark/>
+          </w:tcPr>
+          <w:p>
+            <w:pPr>
+              <w:rPr>
+                <w:rFonts w:ascii="Times New Roman" w:hAnsi="Times New Roman" w:cs="Times New Roman"/>
+                <w:sz w:val="24"/>
+                <w:szCs w:val="24"/>
+              </w:rPr>
+            </w:pPr>
+            <w:r>
+              <w:rPr>
+                <w:rFonts w:ascii="Times New Roman" w:hAnsi="Times New Roman" w:cs="Times New Roman"/>
+                <w:sz w:val="24"/>
+                <w:szCs w:val="24"/>
+              </w:rPr>
+              <w:t>Date</w:t>
+            </w:r>
+          </w:p>
+        </w:tc>
+        <w:tc>
+          <w:tcPr>
+            <w:tcW w:w="0" w:type="auto"/>
+            <w:vAlign w:val="center"/>
+            <w:hideMark/>
+          </w:tcPr>
+          <w:p>
+            <w:pPr>
+              <w:rPr>
+                <w:rFonts w:ascii="Times New Roman" w:hAnsi="Times New Roman" w:cs="Times New Roman"/>
+                <w:sz w:val="24"/>
+                <w:szCs w:val="24"/>
+              </w:rPr>
+            </w:pPr>
+            <w:r>
+              <w:rPr>
+                <w:rFonts w:ascii="Segoe UI Emoji" w:hAnsi="Segoe UI Emoji" w:cs="Segoe UI Emoji"/>
+                <w:sz w:val="24"/>
+                <w:szCs w:val="24"/>
+              </w:rPr>
+              <w:t>✅</w:t>
+            </w:r>
+          </w:p>
+        </w:tc>
+        <w:tc>
+          <w:tcPr>
+            <w:tcW w:w="0" w:type="auto"/>
+            <w:vAlign w:val="center"/>
+            <w:hideMark/>
+          </w:tcPr>
+          <w:p>
+            <w:pPr>
+              <w:rPr>
+                <w:rFonts w:ascii="Times New Roman" w:hAnsi="Times New Roman" w:cs="Times New Roman"/>
+                <w:sz w:val="24"/>
+                <w:szCs w:val="24"/>
+              </w:rPr>
+            </w:pPr>
+            <w:r>
+              <w:rPr>
+                <w:rFonts w:ascii="Times New Roman" w:hAnsi="Times New Roman" w:cs="Times New Roman"/>
+                <w:sz w:val="24"/>
+                <w:szCs w:val="24"/>
+              </w:rPr>
+              <w:t>Listing creation date</w:t>
+            </w:r>
+          </w:p>
+        </w:tc>
+      </w:tr>
+      <w:tr>
+        <w:trPr>
+          <w:tblCellSpacing w:w="15" w:type="dxa"/>
+        </w:trPr>
+        <w:tc>
+          <w:tcPr>
+            <w:tcW w:w="0" w:type="auto"/>
+            <w:vAlign w:val="center"/>
+            <w:hideMark/>
+          </w:tcPr>
+          <w:p>
+            <w:pPr>
+              <w:rPr>
+                <w:rFonts w:ascii="Times New Roman" w:hAnsi="Times New Roman" w:cs="Times New Roman"/>
+                <w:sz w:val="24"/>
+                <w:szCs w:val="24"/>
+              </w:rPr>
+            </w:pPr>
+            <w:proofErr w:type="spellStart"/>
             <w:r>
               <w:rPr>
                 <w:rFonts w:ascii="Times New Roman" w:hAnsi="Times New Roman" w:cs="Times New Roman"/>
@@ -5028,6 +5204,7 @@
               </w:rPr>
               <w:t>updatedAt</w:t>
             </w:r>
+            <w:proofErr w:type="spellEnd"/>
           </w:p>
         </w:tc>
         <w:tc>
@@ -5162,33 +5339,6 @@
       <w:pPr>
         <w:rPr>
           <w:rFonts w:ascii="Times New Roman" w:hAnsi="Times New Roman" w:cs="Times New Roman"/>
-          <w:sz w:val="24"/>
-          <w:szCs w:val="24"/>
-        </w:rPr>
-      </w:pPr>
-    </w:p>
-    <w:p>
-      <w:pPr>
-        <w:rPr>
-          <w:rFonts w:ascii="Times New Roman" w:hAnsi="Times New Roman" w:cs="Times New Roman"/>
-          <w:sz w:val="24"/>
-          <w:szCs w:val="24"/>
-        </w:rPr>
-      </w:pPr>
-    </w:p>
-    <w:p>
-      <w:pPr>
-        <w:rPr>
-          <w:rFonts w:ascii="Times New Roman" w:hAnsi="Times New Roman" w:cs="Times New Roman"/>
-          <w:sz w:val="24"/>
-          <w:szCs w:val="24"/>
-        </w:rPr>
-      </w:pPr>
-    </w:p>
-    <w:p>
-      <w:pPr>
-        <w:rPr>
-          <w:rFonts w:ascii="Times New Roman" w:hAnsi="Times New Roman" w:cs="Times New Roman"/>
           <w:b/>
           <w:bCs/>
           <w:sz w:val="24"/>
@@ -5203,6 +5353,7 @@
           <w:sz w:val="24"/>
           <w:szCs w:val="24"/>
         </w:rPr>
+        <w:lastRenderedPageBreak/>
         <w:t xml:space="preserve">Collection 4 — Exchange Requests </w:t>
       </w:r>
     </w:p>
@@ -5372,6 +5523,7 @@
                 <w:szCs w:val="24"/>
               </w:rPr>
             </w:pPr>
+            <w:proofErr w:type="spellStart"/>
             <w:r>
               <w:rPr>
                 <w:rFonts w:ascii="Times New Roman" w:hAnsi="Times New Roman" w:cs="Times New Roman"/>
@@ -5380,6 +5532,7 @@
               </w:rPr>
               <w:t>ObjectId</w:t>
             </w:r>
+            <w:proofErr w:type="spellEnd"/>
           </w:p>
         </w:tc>
         <w:tc>
@@ -5550,6 +5703,7 @@
                 <w:szCs w:val="24"/>
               </w:rPr>
             </w:pPr>
+            <w:proofErr w:type="spellStart"/>
             <w:r>
               <w:rPr>
                 <w:rFonts w:ascii="Times New Roman" w:hAnsi="Times New Roman" w:cs="Times New Roman"/>
@@ -5558,6 +5712,7 @@
               </w:rPr>
               <w:t>exchangeType</w:t>
             </w:r>
+            <w:proofErr w:type="spellEnd"/>
           </w:p>
         </w:tc>
         <w:tc>
@@ -5651,6 +5806,7 @@
                 <w:szCs w:val="24"/>
               </w:rPr>
             </w:pPr>
+            <w:proofErr w:type="spellStart"/>
             <w:r>
               <w:rPr>
                 <w:rFonts w:ascii="Times New Roman" w:hAnsi="Times New Roman" w:cs="Times New Roman"/>
@@ -5659,6 +5815,7 @@
               </w:rPr>
               <w:t>cycleSize</w:t>
             </w:r>
+            <w:proofErr w:type="spellEnd"/>
           </w:p>
         </w:tc>
         <w:tc>
@@ -5869,6 +6026,7 @@
                 <w:szCs w:val="24"/>
               </w:rPr>
             </w:pPr>
+            <w:proofErr w:type="spellStart"/>
             <w:r>
               <w:rPr>
                 <w:rFonts w:ascii="Times New Roman" w:hAnsi="Times New Roman" w:cs="Times New Roman"/>
@@ -5877,29 +6035,40 @@
               </w:rPr>
               <w:t>initiatedBy</w:t>
             </w:r>
-          </w:p>
-        </w:tc>
-        <w:tc>
-          <w:tcPr>
-            <w:tcW w:w="0" w:type="auto"/>
-            <w:vAlign w:val="center"/>
-            <w:hideMark/>
-          </w:tcPr>
-          <w:p>
-            <w:pPr>
-              <w:rPr>
-                <w:rFonts w:ascii="Times New Roman" w:hAnsi="Times New Roman" w:cs="Times New Roman"/>
-                <w:sz w:val="24"/>
-                <w:szCs w:val="24"/>
-              </w:rPr>
-            </w:pPr>
-            <w:r>
-              <w:rPr>
-                <w:rFonts w:ascii="Times New Roman" w:hAnsi="Times New Roman" w:cs="Times New Roman"/>
-                <w:sz w:val="24"/>
-                <w:szCs w:val="24"/>
-              </w:rPr>
-              <w:t>ObjectId (User)</w:t>
+            <w:proofErr w:type="spellEnd"/>
+          </w:p>
+        </w:tc>
+        <w:tc>
+          <w:tcPr>
+            <w:tcW w:w="0" w:type="auto"/>
+            <w:vAlign w:val="center"/>
+            <w:hideMark/>
+          </w:tcPr>
+          <w:p>
+            <w:pPr>
+              <w:rPr>
+                <w:rFonts w:ascii="Times New Roman" w:hAnsi="Times New Roman" w:cs="Times New Roman"/>
+                <w:sz w:val="24"/>
+                <w:szCs w:val="24"/>
+              </w:rPr>
+            </w:pPr>
+            <w:proofErr w:type="spellStart"/>
+            <w:r>
+              <w:rPr>
+                <w:rFonts w:ascii="Times New Roman" w:hAnsi="Times New Roman" w:cs="Times New Roman"/>
+                <w:sz w:val="24"/>
+                <w:szCs w:val="24"/>
+              </w:rPr>
+              <w:t>ObjectId</w:t>
+            </w:r>
+            <w:proofErr w:type="spellEnd"/>
+            <w:r>
+              <w:rPr>
+                <w:rFonts w:ascii="Times New Roman" w:hAnsi="Times New Roman" w:cs="Times New Roman"/>
+                <w:sz w:val="24"/>
+                <w:szCs w:val="24"/>
+              </w:rPr>
+              <w:t xml:space="preserve"> (User)</w:t>
             </w:r>
           </w:p>
         </w:tc>
@@ -5970,6 +6139,7 @@
                 <w:szCs w:val="24"/>
               </w:rPr>
             </w:pPr>
+            <w:proofErr w:type="spellStart"/>
             <w:r>
               <w:rPr>
                 <w:rFonts w:ascii="Times New Roman" w:hAnsi="Times New Roman" w:cs="Times New Roman"/>
@@ -5978,22 +6148,24 @@
               </w:rPr>
               <w:t>exchangeRoomId</w:t>
             </w:r>
-          </w:p>
-        </w:tc>
-        <w:tc>
-          <w:tcPr>
-            <w:tcW w:w="0" w:type="auto"/>
-            <w:vAlign w:val="center"/>
-            <w:hideMark/>
-          </w:tcPr>
-          <w:p>
-            <w:pPr>
-              <w:rPr>
-                <w:rFonts w:ascii="Times New Roman" w:hAnsi="Times New Roman" w:cs="Times New Roman"/>
-                <w:sz w:val="24"/>
-                <w:szCs w:val="24"/>
-              </w:rPr>
-            </w:pPr>
+            <w:proofErr w:type="spellEnd"/>
+          </w:p>
+        </w:tc>
+        <w:tc>
+          <w:tcPr>
+            <w:tcW w:w="0" w:type="auto"/>
+            <w:vAlign w:val="center"/>
+            <w:hideMark/>
+          </w:tcPr>
+          <w:p>
+            <w:pPr>
+              <w:rPr>
+                <w:rFonts w:ascii="Times New Roman" w:hAnsi="Times New Roman" w:cs="Times New Roman"/>
+                <w:sz w:val="24"/>
+                <w:szCs w:val="24"/>
+              </w:rPr>
+            </w:pPr>
+            <w:proofErr w:type="spellStart"/>
             <w:r>
               <w:rPr>
                 <w:rFonts w:ascii="Times New Roman" w:hAnsi="Times New Roman" w:cs="Times New Roman"/>
@@ -6002,6 +6174,7 @@
               </w:rPr>
               <w:t>ObjectId</w:t>
             </w:r>
+            <w:proofErr w:type="spellEnd"/>
           </w:p>
         </w:tc>
         <w:tc>
@@ -6071,6 +6244,7 @@
                 <w:szCs w:val="24"/>
               </w:rPr>
             </w:pPr>
+            <w:proofErr w:type="spellStart"/>
             <w:r>
               <w:rPr>
                 <w:rFonts w:ascii="Times New Roman" w:hAnsi="Times New Roman" w:cs="Times New Roman"/>
@@ -6079,6 +6253,7 @@
               </w:rPr>
               <w:t>createdAt</w:t>
             </w:r>
+            <w:proofErr w:type="spellEnd"/>
           </w:p>
         </w:tc>
         <w:tc>
@@ -6173,6 +6348,7 @@
                 <w:szCs w:val="24"/>
               </w:rPr>
             </w:pPr>
+            <w:proofErr w:type="spellStart"/>
             <w:r>
               <w:rPr>
                 <w:rFonts w:ascii="Times New Roman" w:hAnsi="Times New Roman" w:cs="Times New Roman"/>
@@ -6181,6 +6357,7 @@
               </w:rPr>
               <w:t>updatedAt</w:t>
             </w:r>
+            <w:proofErr w:type="spellEnd"/>
           </w:p>
         </w:tc>
         <w:tc>
@@ -6401,6 +6578,7 @@
           <w:sz w:val="24"/>
           <w:szCs w:val="24"/>
         </w:rPr>
+        <w:lastRenderedPageBreak/>
         <w:t>Collection 5 — Exchange Rooms</w:t>
       </w:r>
     </w:p>
@@ -6570,6 +6748,7 @@
                 <w:szCs w:val="24"/>
               </w:rPr>
             </w:pPr>
+            <w:proofErr w:type="spellStart"/>
             <w:r>
               <w:rPr>
                 <w:rFonts w:ascii="Times New Roman" w:hAnsi="Times New Roman" w:cs="Times New Roman"/>
@@ -6578,6 +6757,7 @@
               </w:rPr>
               <w:t>ObjectId</w:t>
             </w:r>
+            <w:proofErr w:type="spellEnd"/>
           </w:p>
         </w:tc>
         <w:tc>
@@ -6647,6 +6827,7 @@
                 <w:szCs w:val="24"/>
               </w:rPr>
             </w:pPr>
+            <w:proofErr w:type="spellStart"/>
             <w:r>
               <w:rPr>
                 <w:rFonts w:ascii="Times New Roman" w:hAnsi="Times New Roman" w:cs="Times New Roman"/>
@@ -6655,29 +6836,58 @@
               </w:rPr>
               <w:t>exchangeRequestId</w:t>
             </w:r>
-          </w:p>
-        </w:tc>
-        <w:tc>
-          <w:tcPr>
-            <w:tcW w:w="0" w:type="auto"/>
-            <w:vAlign w:val="center"/>
-            <w:hideMark/>
-          </w:tcPr>
-          <w:p>
-            <w:pPr>
-              <w:rPr>
-                <w:rFonts w:ascii="Times New Roman" w:hAnsi="Times New Roman" w:cs="Times New Roman"/>
-                <w:sz w:val="24"/>
-                <w:szCs w:val="24"/>
-              </w:rPr>
-            </w:pPr>
-            <w:r>
-              <w:rPr>
-                <w:rFonts w:ascii="Times New Roman" w:hAnsi="Times New Roman" w:cs="Times New Roman"/>
-                <w:sz w:val="24"/>
-                <w:szCs w:val="24"/>
-              </w:rPr>
-              <w:t>ObjectId (ExchangeRequest)</w:t>
+            <w:proofErr w:type="spellEnd"/>
+          </w:p>
+        </w:tc>
+        <w:tc>
+          <w:tcPr>
+            <w:tcW w:w="0" w:type="auto"/>
+            <w:vAlign w:val="center"/>
+            <w:hideMark/>
+          </w:tcPr>
+          <w:p>
+            <w:pPr>
+              <w:rPr>
+                <w:rFonts w:ascii="Times New Roman" w:hAnsi="Times New Roman" w:cs="Times New Roman"/>
+                <w:sz w:val="24"/>
+                <w:szCs w:val="24"/>
+              </w:rPr>
+            </w:pPr>
+            <w:proofErr w:type="spellStart"/>
+            <w:r>
+              <w:rPr>
+                <w:rFonts w:ascii="Times New Roman" w:hAnsi="Times New Roman" w:cs="Times New Roman"/>
+                <w:sz w:val="24"/>
+                <w:szCs w:val="24"/>
+              </w:rPr>
+              <w:t>ObjectId</w:t>
+            </w:r>
+            <w:proofErr w:type="spellEnd"/>
+            <w:r>
+              <w:rPr>
+                <w:rFonts w:ascii="Times New Roman" w:hAnsi="Times New Roman" w:cs="Times New Roman"/>
+                <w:sz w:val="24"/>
+                <w:szCs w:val="24"/>
+              </w:rPr>
+              <w:t xml:space="preserve"> (</w:t>
+            </w:r>
+            <w:proofErr w:type="spellStart"/>
+            <w:r>
+              <w:rPr>
+                <w:rFonts w:ascii="Times New Roman" w:hAnsi="Times New Roman" w:cs="Times New Roman"/>
+                <w:sz w:val="24"/>
+                <w:szCs w:val="24"/>
+              </w:rPr>
+              <w:t>ExchangeRequest</w:t>
+            </w:r>
+            <w:proofErr w:type="spellEnd"/>
+            <w:r>
+              <w:rPr>
+                <w:rFonts w:ascii="Times New Roman" w:hAnsi="Times New Roman" w:cs="Times New Roman"/>
+                <w:sz w:val="24"/>
+                <w:szCs w:val="24"/>
+              </w:rPr>
+              <w:t>)</w:t>
             </w:r>
           </w:p>
         </w:tc>
@@ -6778,7 +6988,25 @@
                 <w:sz w:val="24"/>
                 <w:szCs w:val="24"/>
               </w:rPr>
-              <w:t>Array&lt;ObjectId&gt;</w:t>
+              <w:t>Array&lt;</w:t>
+            </w:r>
+            <w:proofErr w:type="spellStart"/>
+            <w:r>
+              <w:rPr>
+                <w:rFonts w:ascii="Times New Roman" w:hAnsi="Times New Roman" w:cs="Times New Roman"/>
+                <w:sz w:val="24"/>
+                <w:szCs w:val="24"/>
+              </w:rPr>
+              <w:t>ObjectId</w:t>
+            </w:r>
+            <w:proofErr w:type="spellEnd"/>
+            <w:r>
+              <w:rPr>
+                <w:rFonts w:ascii="Times New Roman" w:hAnsi="Times New Roman" w:cs="Times New Roman"/>
+                <w:sz w:val="24"/>
+                <w:szCs w:val="24"/>
+              </w:rPr>
+              <w:t>&gt;</w:t>
             </w:r>
           </w:p>
         </w:tc>
@@ -6950,6 +7178,7 @@
                 <w:szCs w:val="24"/>
               </w:rPr>
             </w:pPr>
+            <w:proofErr w:type="spellStart"/>
             <w:r>
               <w:rPr>
                 <w:rFonts w:ascii="Times New Roman" w:hAnsi="Times New Roman" w:cs="Times New Roman"/>
@@ -6958,6 +7187,7 @@
               </w:rPr>
               <w:t>exchangeStatus</w:t>
             </w:r>
+            <w:proofErr w:type="spellEnd"/>
           </w:p>
         </w:tc>
         <w:tc>
@@ -7051,6 +7281,7 @@
                 <w:szCs w:val="24"/>
               </w:rPr>
             </w:pPr>
+            <w:proofErr w:type="spellStart"/>
             <w:r>
               <w:rPr>
                 <w:rFonts w:ascii="Times New Roman" w:hAnsi="Times New Roman" w:cs="Times New Roman"/>
@@ -7059,6 +7290,7 @@
               </w:rPr>
               <w:t>confirmationStatus</w:t>
             </w:r>
+            <w:proofErr w:type="spellEnd"/>
           </w:p>
         </w:tc>
         <w:tc>
@@ -7152,6 +7384,7 @@
                 <w:szCs w:val="24"/>
               </w:rPr>
             </w:pPr>
+            <w:proofErr w:type="spellStart"/>
             <w:r>
               <w:rPr>
                 <w:rFonts w:ascii="Times New Roman" w:hAnsi="Times New Roman" w:cs="Times New Roman"/>
@@ -7160,6 +7393,7 @@
               </w:rPr>
               <w:t>createdAt</w:t>
             </w:r>
+            <w:proofErr w:type="spellEnd"/>
           </w:p>
         </w:tc>
         <w:tc>
@@ -7253,6 +7487,7 @@
                 <w:szCs w:val="24"/>
               </w:rPr>
             </w:pPr>
+            <w:proofErr w:type="spellStart"/>
             <w:r>
               <w:rPr>
                 <w:rFonts w:ascii="Times New Roman" w:hAnsi="Times New Roman" w:cs="Times New Roman"/>
@@ -7261,6 +7496,7 @@
               </w:rPr>
               <w:t>updatedAt</w:t>
             </w:r>
+            <w:proofErr w:type="spellEnd"/>
           </w:p>
         </w:tc>
         <w:tc>
@@ -7449,6 +7685,28 @@
       <w:pPr>
         <w:rPr>
           <w:rFonts w:ascii="Times New Roman" w:hAnsi="Times New Roman" w:cs="Times New Roman"/>
+          <w:sz w:val="24"/>
+          <w:szCs w:val="24"/>
+        </w:rPr>
+      </w:pPr>
+    </w:p>
+    <w:p>
+      <w:pPr>
+        <w:rPr>
+          <w:rFonts w:ascii="Times New Roman" w:hAnsi="Times New Roman" w:cs="Times New Roman"/>
+          <w:b/>
+          <w:bCs/>
+          <w:sz w:val="24"/>
+          <w:szCs w:val="24"/>
+        </w:rPr>
+      </w:pPr>
+    </w:p>
+    <w:p>
+      <w:pPr>
+        <w:rPr>
+          <w:rFonts w:ascii="Times New Roman" w:hAnsi="Times New Roman" w:cs="Times New Roman"/>
+          <w:b/>
+          <w:bCs/>
           <w:sz w:val="24"/>
           <w:szCs w:val="24"/>
         </w:rPr>
@@ -7642,6 +7900,7 @@
                 <w:szCs w:val="24"/>
               </w:rPr>
             </w:pPr>
+            <w:proofErr w:type="spellStart"/>
             <w:r>
               <w:rPr>
                 <w:rFonts w:ascii="Times New Roman" w:hAnsi="Times New Roman" w:cs="Times New Roman"/>
@@ -7650,6 +7909,7 @@
               </w:rPr>
               <w:t>ObjectId</w:t>
             </w:r>
+            <w:proofErr w:type="spellEnd"/>
           </w:p>
         </w:tc>
         <w:tc>
@@ -7719,6 +7979,7 @@
                 <w:szCs w:val="24"/>
               </w:rPr>
             </w:pPr>
+            <w:proofErr w:type="spellStart"/>
             <w:r>
               <w:rPr>
                 <w:rFonts w:ascii="Times New Roman" w:hAnsi="Times New Roman" w:cs="Times New Roman"/>
@@ -7727,29 +7988,58 @@
               </w:rPr>
               <w:t>exchangeRoomId</w:t>
             </w:r>
-          </w:p>
-        </w:tc>
-        <w:tc>
-          <w:tcPr>
-            <w:tcW w:w="0" w:type="auto"/>
-            <w:vAlign w:val="center"/>
-            <w:hideMark/>
-          </w:tcPr>
-          <w:p>
-            <w:pPr>
-              <w:rPr>
-                <w:rFonts w:ascii="Times New Roman" w:hAnsi="Times New Roman" w:cs="Times New Roman"/>
-                <w:sz w:val="24"/>
-                <w:szCs w:val="24"/>
-              </w:rPr>
-            </w:pPr>
-            <w:r>
-              <w:rPr>
-                <w:rFonts w:ascii="Times New Roman" w:hAnsi="Times New Roman" w:cs="Times New Roman"/>
-                <w:sz w:val="24"/>
-                <w:szCs w:val="24"/>
-              </w:rPr>
-              <w:t>ObjectId (ExchangeRoom)</w:t>
+            <w:proofErr w:type="spellEnd"/>
+          </w:p>
+        </w:tc>
+        <w:tc>
+          <w:tcPr>
+            <w:tcW w:w="0" w:type="auto"/>
+            <w:vAlign w:val="center"/>
+            <w:hideMark/>
+          </w:tcPr>
+          <w:p>
+            <w:pPr>
+              <w:rPr>
+                <w:rFonts w:ascii="Times New Roman" w:hAnsi="Times New Roman" w:cs="Times New Roman"/>
+                <w:sz w:val="24"/>
+                <w:szCs w:val="24"/>
+              </w:rPr>
+            </w:pPr>
+            <w:proofErr w:type="spellStart"/>
+            <w:r>
+              <w:rPr>
+                <w:rFonts w:ascii="Times New Roman" w:hAnsi="Times New Roman" w:cs="Times New Roman"/>
+                <w:sz w:val="24"/>
+                <w:szCs w:val="24"/>
+              </w:rPr>
+              <w:t>ObjectId</w:t>
+            </w:r>
+            <w:proofErr w:type="spellEnd"/>
+            <w:r>
+              <w:rPr>
+                <w:rFonts w:ascii="Times New Roman" w:hAnsi="Times New Roman" w:cs="Times New Roman"/>
+                <w:sz w:val="24"/>
+                <w:szCs w:val="24"/>
+              </w:rPr>
+              <w:t xml:space="preserve"> (</w:t>
+            </w:r>
+            <w:proofErr w:type="spellStart"/>
+            <w:r>
+              <w:rPr>
+                <w:rFonts w:ascii="Times New Roman" w:hAnsi="Times New Roman" w:cs="Times New Roman"/>
+                <w:sz w:val="24"/>
+                <w:szCs w:val="24"/>
+              </w:rPr>
+              <w:t>ExchangeRoom</w:t>
+            </w:r>
+            <w:proofErr w:type="spellEnd"/>
+            <w:r>
+              <w:rPr>
+                <w:rFonts w:ascii="Times New Roman" w:hAnsi="Times New Roman" w:cs="Times New Roman"/>
+                <w:sz w:val="24"/>
+                <w:szCs w:val="24"/>
+              </w:rPr>
+              <w:t>)</w:t>
             </w:r>
           </w:p>
         </w:tc>
@@ -7820,6 +8110,7 @@
                 <w:szCs w:val="24"/>
               </w:rPr>
             </w:pPr>
+            <w:proofErr w:type="spellStart"/>
             <w:r>
               <w:rPr>
                 <w:rFonts w:ascii="Times New Roman" w:hAnsi="Times New Roman" w:cs="Times New Roman"/>
@@ -7828,29 +8119,40 @@
               </w:rPr>
               <w:t>senderId</w:t>
             </w:r>
-          </w:p>
-        </w:tc>
-        <w:tc>
-          <w:tcPr>
-            <w:tcW w:w="0" w:type="auto"/>
-            <w:vAlign w:val="center"/>
-            <w:hideMark/>
-          </w:tcPr>
-          <w:p>
-            <w:pPr>
-              <w:rPr>
-                <w:rFonts w:ascii="Times New Roman" w:hAnsi="Times New Roman" w:cs="Times New Roman"/>
-                <w:sz w:val="24"/>
-                <w:szCs w:val="24"/>
-              </w:rPr>
-            </w:pPr>
-            <w:r>
-              <w:rPr>
-                <w:rFonts w:ascii="Times New Roman" w:hAnsi="Times New Roman" w:cs="Times New Roman"/>
-                <w:sz w:val="24"/>
-                <w:szCs w:val="24"/>
-              </w:rPr>
-              <w:t>ObjectId (User)</w:t>
+            <w:proofErr w:type="spellEnd"/>
+          </w:p>
+        </w:tc>
+        <w:tc>
+          <w:tcPr>
+            <w:tcW w:w="0" w:type="auto"/>
+            <w:vAlign w:val="center"/>
+            <w:hideMark/>
+          </w:tcPr>
+          <w:p>
+            <w:pPr>
+              <w:rPr>
+                <w:rFonts w:ascii="Times New Roman" w:hAnsi="Times New Roman" w:cs="Times New Roman"/>
+                <w:sz w:val="24"/>
+                <w:szCs w:val="24"/>
+              </w:rPr>
+            </w:pPr>
+            <w:proofErr w:type="spellStart"/>
+            <w:r>
+              <w:rPr>
+                <w:rFonts w:ascii="Times New Roman" w:hAnsi="Times New Roman" w:cs="Times New Roman"/>
+                <w:sz w:val="24"/>
+                <w:szCs w:val="24"/>
+              </w:rPr>
+              <w:t>ObjectId</w:t>
+            </w:r>
+            <w:proofErr w:type="spellEnd"/>
+            <w:r>
+              <w:rPr>
+                <w:rFonts w:ascii="Times New Roman" w:hAnsi="Times New Roman" w:cs="Times New Roman"/>
+                <w:sz w:val="24"/>
+                <w:szCs w:val="24"/>
+              </w:rPr>
+              <w:t xml:space="preserve"> (User)</w:t>
             </w:r>
           </w:p>
         </w:tc>
@@ -7921,6 +8223,7 @@
                 <w:szCs w:val="24"/>
               </w:rPr>
             </w:pPr>
+            <w:proofErr w:type="spellStart"/>
             <w:r>
               <w:rPr>
                 <w:rFonts w:ascii="Times New Roman" w:hAnsi="Times New Roman" w:cs="Times New Roman"/>
@@ -7929,6 +8232,7 @@
               </w:rPr>
               <w:t>messageType</w:t>
             </w:r>
+            <w:proofErr w:type="spellEnd"/>
           </w:p>
         </w:tc>
         <w:tc>
@@ -8123,6 +8427,7 @@
                 <w:szCs w:val="24"/>
               </w:rPr>
             </w:pPr>
+            <w:proofErr w:type="spellStart"/>
             <w:r>
               <w:rPr>
                 <w:rFonts w:ascii="Times New Roman" w:hAnsi="Times New Roman" w:cs="Times New Roman"/>
@@ -8131,6 +8436,7 @@
               </w:rPr>
               <w:t>imageUrl</w:t>
             </w:r>
+            <w:proofErr w:type="spellEnd"/>
           </w:p>
         </w:tc>
         <w:tc>
@@ -8195,13 +8501,23 @@
                 <w:szCs w:val="24"/>
               </w:rPr>
             </w:pPr>
-            <w:r>
-              <w:rPr>
-                <w:rFonts w:ascii="Times New Roman" w:hAnsi="Times New Roman" w:cs="Times New Roman"/>
-                <w:sz w:val="24"/>
-                <w:szCs w:val="24"/>
-              </w:rPr>
-              <w:t>Cloudinary image URL (only for IMAGE messages)</w:t>
+            <w:proofErr w:type="spellStart"/>
+            <w:r>
+              <w:rPr>
+                <w:rFonts w:ascii="Times New Roman" w:hAnsi="Times New Roman" w:cs="Times New Roman"/>
+                <w:sz w:val="24"/>
+                <w:szCs w:val="24"/>
+              </w:rPr>
+              <w:t>Cloudinary</w:t>
+            </w:r>
+            <w:proofErr w:type="spellEnd"/>
+            <w:r>
+              <w:rPr>
+                <w:rFonts w:ascii="Times New Roman" w:hAnsi="Times New Roman" w:cs="Times New Roman"/>
+                <w:sz w:val="24"/>
+                <w:szCs w:val="24"/>
+              </w:rPr>
+              <w:t xml:space="preserve"> image URL (only for IMAGE messages)</w:t>
             </w:r>
           </w:p>
         </w:tc>
@@ -8224,6 +8540,7 @@
                 <w:szCs w:val="24"/>
               </w:rPr>
             </w:pPr>
+            <w:proofErr w:type="spellStart"/>
             <w:r>
               <w:rPr>
                 <w:rFonts w:ascii="Times New Roman" w:hAnsi="Times New Roman" w:cs="Times New Roman"/>
@@ -8232,6 +8549,7 @@
               </w:rPr>
               <w:t>sentAt</w:t>
             </w:r>
+            <w:proofErr w:type="spellEnd"/>
           </w:p>
         </w:tc>
         <w:tc>
@@ -8658,6 +8976,7 @@
                 <w:szCs w:val="24"/>
               </w:rPr>
             </w:pPr>
+            <w:proofErr w:type="spellStart"/>
             <w:r>
               <w:rPr>
                 <w:rFonts w:ascii="Times New Roman" w:hAnsi="Times New Roman" w:cs="Times New Roman"/>
@@ -8666,6 +8985,7 @@
               </w:rPr>
               <w:t>ObjectId</w:t>
             </w:r>
+            <w:proofErr w:type="spellEnd"/>
           </w:p>
         </w:tc>
         <w:tc>
@@ -8735,6 +9055,7 @@
                 <w:szCs w:val="24"/>
               </w:rPr>
             </w:pPr>
+            <w:proofErr w:type="spellStart"/>
             <w:r>
               <w:rPr>
                 <w:rFonts w:ascii="Times New Roman" w:hAnsi="Times New Roman" w:cs="Times New Roman"/>
@@ -8743,29 +9064,40 @@
               </w:rPr>
               <w:t>recipientId</w:t>
             </w:r>
-          </w:p>
-        </w:tc>
-        <w:tc>
-          <w:tcPr>
-            <w:tcW w:w="0" w:type="auto"/>
-            <w:vAlign w:val="center"/>
-            <w:hideMark/>
-          </w:tcPr>
-          <w:p>
-            <w:pPr>
-              <w:rPr>
-                <w:rFonts w:ascii="Times New Roman" w:hAnsi="Times New Roman" w:cs="Times New Roman"/>
-                <w:sz w:val="24"/>
-                <w:szCs w:val="24"/>
-              </w:rPr>
-            </w:pPr>
-            <w:r>
-              <w:rPr>
-                <w:rFonts w:ascii="Times New Roman" w:hAnsi="Times New Roman" w:cs="Times New Roman"/>
-                <w:sz w:val="24"/>
-                <w:szCs w:val="24"/>
-              </w:rPr>
-              <w:t>ObjectId (User)</w:t>
+            <w:proofErr w:type="spellEnd"/>
+          </w:p>
+        </w:tc>
+        <w:tc>
+          <w:tcPr>
+            <w:tcW w:w="0" w:type="auto"/>
+            <w:vAlign w:val="center"/>
+            <w:hideMark/>
+          </w:tcPr>
+          <w:p>
+            <w:pPr>
+              <w:rPr>
+                <w:rFonts w:ascii="Times New Roman" w:hAnsi="Times New Roman" w:cs="Times New Roman"/>
+                <w:sz w:val="24"/>
+                <w:szCs w:val="24"/>
+              </w:rPr>
+            </w:pPr>
+            <w:proofErr w:type="spellStart"/>
+            <w:r>
+              <w:rPr>
+                <w:rFonts w:ascii="Times New Roman" w:hAnsi="Times New Roman" w:cs="Times New Roman"/>
+                <w:sz w:val="24"/>
+                <w:szCs w:val="24"/>
+              </w:rPr>
+              <w:t>ObjectId</w:t>
+            </w:r>
+            <w:proofErr w:type="spellEnd"/>
+            <w:r>
+              <w:rPr>
+                <w:rFonts w:ascii="Times New Roman" w:hAnsi="Times New Roman" w:cs="Times New Roman"/>
+                <w:sz w:val="24"/>
+                <w:szCs w:val="24"/>
+              </w:rPr>
+              <w:t xml:space="preserve"> (User)</w:t>
             </w:r>
           </w:p>
         </w:tc>
@@ -8836,6 +9168,7 @@
                 <w:szCs w:val="24"/>
               </w:rPr>
             </w:pPr>
+            <w:proofErr w:type="spellStart"/>
             <w:r>
               <w:rPr>
                 <w:rFonts w:ascii="Times New Roman" w:hAnsi="Times New Roman" w:cs="Times New Roman"/>
@@ -8844,29 +9177,40 @@
               </w:rPr>
               <w:t>senderId</w:t>
             </w:r>
-          </w:p>
-        </w:tc>
-        <w:tc>
-          <w:tcPr>
-            <w:tcW w:w="0" w:type="auto"/>
-            <w:vAlign w:val="center"/>
-            <w:hideMark/>
-          </w:tcPr>
-          <w:p>
-            <w:pPr>
-              <w:rPr>
-                <w:rFonts w:ascii="Times New Roman" w:hAnsi="Times New Roman" w:cs="Times New Roman"/>
-                <w:sz w:val="24"/>
-                <w:szCs w:val="24"/>
-              </w:rPr>
-            </w:pPr>
-            <w:r>
-              <w:rPr>
-                <w:rFonts w:ascii="Times New Roman" w:hAnsi="Times New Roman" w:cs="Times New Roman"/>
-                <w:sz w:val="24"/>
-                <w:szCs w:val="24"/>
-              </w:rPr>
-              <w:t>ObjectId (User)</w:t>
+            <w:proofErr w:type="spellEnd"/>
+          </w:p>
+        </w:tc>
+        <w:tc>
+          <w:tcPr>
+            <w:tcW w:w="0" w:type="auto"/>
+            <w:vAlign w:val="center"/>
+            <w:hideMark/>
+          </w:tcPr>
+          <w:p>
+            <w:pPr>
+              <w:rPr>
+                <w:rFonts w:ascii="Times New Roman" w:hAnsi="Times New Roman" w:cs="Times New Roman"/>
+                <w:sz w:val="24"/>
+                <w:szCs w:val="24"/>
+              </w:rPr>
+            </w:pPr>
+            <w:proofErr w:type="spellStart"/>
+            <w:r>
+              <w:rPr>
+                <w:rFonts w:ascii="Times New Roman" w:hAnsi="Times New Roman" w:cs="Times New Roman"/>
+                <w:sz w:val="24"/>
+                <w:szCs w:val="24"/>
+              </w:rPr>
+              <w:t>ObjectId</w:t>
+            </w:r>
+            <w:proofErr w:type="spellEnd"/>
+            <w:r>
+              <w:rPr>
+                <w:rFonts w:ascii="Times New Roman" w:hAnsi="Times New Roman" w:cs="Times New Roman"/>
+                <w:sz w:val="24"/>
+                <w:szCs w:val="24"/>
+              </w:rPr>
+              <w:t xml:space="preserve"> (User)</w:t>
             </w:r>
           </w:p>
         </w:tc>
@@ -8937,6 +9281,7 @@
                 <w:szCs w:val="24"/>
               </w:rPr>
             </w:pPr>
+            <w:proofErr w:type="spellStart"/>
             <w:r>
               <w:rPr>
                 <w:rFonts w:ascii="Times New Roman" w:hAnsi="Times New Roman" w:cs="Times New Roman"/>
@@ -8945,6 +9290,7 @@
               </w:rPr>
               <w:t>notificationType</w:t>
             </w:r>
+            <w:proofErr w:type="spellEnd"/>
           </w:p>
         </w:tc>
         <w:tc>
@@ -9240,6 +9586,7 @@
                 <w:szCs w:val="24"/>
               </w:rPr>
             </w:pPr>
+            <w:proofErr w:type="spellStart"/>
             <w:r>
               <w:rPr>
                 <w:rFonts w:ascii="Times New Roman" w:hAnsi="Times New Roman" w:cs="Times New Roman"/>
@@ -9248,22 +9595,24 @@
               </w:rPr>
               <w:t>referenceId</w:t>
             </w:r>
-          </w:p>
-        </w:tc>
-        <w:tc>
-          <w:tcPr>
-            <w:tcW w:w="0" w:type="auto"/>
-            <w:vAlign w:val="center"/>
-            <w:hideMark/>
-          </w:tcPr>
-          <w:p>
-            <w:pPr>
-              <w:rPr>
-                <w:rFonts w:ascii="Times New Roman" w:hAnsi="Times New Roman" w:cs="Times New Roman"/>
-                <w:sz w:val="24"/>
-                <w:szCs w:val="24"/>
-              </w:rPr>
-            </w:pPr>
+            <w:proofErr w:type="spellEnd"/>
+          </w:p>
+        </w:tc>
+        <w:tc>
+          <w:tcPr>
+            <w:tcW w:w="0" w:type="auto"/>
+            <w:vAlign w:val="center"/>
+            <w:hideMark/>
+          </w:tcPr>
+          <w:p>
+            <w:pPr>
+              <w:rPr>
+                <w:rFonts w:ascii="Times New Roman" w:hAnsi="Times New Roman" w:cs="Times New Roman"/>
+                <w:sz w:val="24"/>
+                <w:szCs w:val="24"/>
+              </w:rPr>
+            </w:pPr>
+            <w:proofErr w:type="spellStart"/>
             <w:r>
               <w:rPr>
                 <w:rFonts w:ascii="Times New Roman" w:hAnsi="Times New Roman" w:cs="Times New Roman"/>
@@ -9272,6 +9621,7 @@
               </w:rPr>
               <w:t>ObjectId</w:t>
             </w:r>
+            <w:proofErr w:type="spellEnd"/>
           </w:p>
         </w:tc>
         <w:tc>
@@ -9341,6 +9691,7 @@
                 <w:szCs w:val="24"/>
               </w:rPr>
             </w:pPr>
+            <w:proofErr w:type="spellStart"/>
             <w:r>
               <w:rPr>
                 <w:rFonts w:ascii="Times New Roman" w:hAnsi="Times New Roman" w:cs="Times New Roman"/>
@@ -9349,6 +9700,7 @@
               </w:rPr>
               <w:t>referenceType</w:t>
             </w:r>
+            <w:proofErr w:type="spellEnd"/>
           </w:p>
         </w:tc>
         <w:tc>
@@ -9442,6 +9794,7 @@
                 <w:szCs w:val="24"/>
               </w:rPr>
             </w:pPr>
+            <w:proofErr w:type="spellStart"/>
             <w:r>
               <w:rPr>
                 <w:rFonts w:ascii="Times New Roman" w:hAnsi="Times New Roman" w:cs="Times New Roman"/>
@@ -9450,6 +9803,7 @@
               </w:rPr>
               <w:t>isRead</w:t>
             </w:r>
+            <w:proofErr w:type="spellEnd"/>
           </w:p>
         </w:tc>
         <w:tc>
@@ -9543,6 +9897,7 @@
                 <w:szCs w:val="24"/>
               </w:rPr>
             </w:pPr>
+            <w:proofErr w:type="spellStart"/>
             <w:r>
               <w:rPr>
                 <w:rFonts w:ascii="Times New Roman" w:hAnsi="Times New Roman" w:cs="Times New Roman"/>
@@ -9551,6 +9906,7 @@
               </w:rPr>
               <w:t>createdAt</w:t>
             </w:r>
+            <w:proofErr w:type="spellEnd"/>
           </w:p>
         </w:tc>
         <w:tc>
@@ -9960,6 +10316,7 @@
                 <w:szCs w:val="24"/>
               </w:rPr>
             </w:pPr>
+            <w:proofErr w:type="spellStart"/>
             <w:r>
               <w:rPr>
                 <w:rFonts w:ascii="Times New Roman" w:hAnsi="Times New Roman" w:cs="Times New Roman"/>
@@ -9968,6 +10325,7 @@
               </w:rPr>
               <w:t>ObjectId</w:t>
             </w:r>
+            <w:proofErr w:type="spellEnd"/>
           </w:p>
         </w:tc>
         <w:tc>
@@ -10037,6 +10395,7 @@
                 <w:szCs w:val="24"/>
               </w:rPr>
             </w:pPr>
+            <w:proofErr w:type="spellStart"/>
             <w:r>
               <w:rPr>
                 <w:rFonts w:ascii="Times New Roman" w:hAnsi="Times New Roman" w:cs="Times New Roman"/>
@@ -10045,22 +10404,24 @@
               </w:rPr>
               <w:t>exchangeRoomId</w:t>
             </w:r>
-          </w:p>
-        </w:tc>
-        <w:tc>
-          <w:tcPr>
-            <w:tcW w:w="0" w:type="auto"/>
-            <w:vAlign w:val="center"/>
-            <w:hideMark/>
-          </w:tcPr>
-          <w:p>
-            <w:pPr>
-              <w:rPr>
-                <w:rFonts w:ascii="Times New Roman" w:hAnsi="Times New Roman" w:cs="Times New Roman"/>
-                <w:sz w:val="24"/>
-                <w:szCs w:val="24"/>
-              </w:rPr>
-            </w:pPr>
+            <w:proofErr w:type="spellEnd"/>
+          </w:p>
+        </w:tc>
+        <w:tc>
+          <w:tcPr>
+            <w:tcW w:w="0" w:type="auto"/>
+            <w:vAlign w:val="center"/>
+            <w:hideMark/>
+          </w:tcPr>
+          <w:p>
+            <w:pPr>
+              <w:rPr>
+                <w:rFonts w:ascii="Times New Roman" w:hAnsi="Times New Roman" w:cs="Times New Roman"/>
+                <w:sz w:val="24"/>
+                <w:szCs w:val="24"/>
+              </w:rPr>
+            </w:pPr>
+            <w:proofErr w:type="spellStart"/>
             <w:r>
               <w:rPr>
                 <w:rFonts w:ascii="Times New Roman" w:hAnsi="Times New Roman" w:cs="Times New Roman"/>
@@ -10069,6 +10430,7 @@
               </w:rPr>
               <w:t>ObjectId</w:t>
             </w:r>
+            <w:proofErr w:type="spellEnd"/>
           </w:p>
         </w:tc>
         <w:tc>
@@ -10138,6 +10500,7 @@
                 <w:szCs w:val="24"/>
               </w:rPr>
             </w:pPr>
+            <w:proofErr w:type="spellStart"/>
             <w:r>
               <w:rPr>
                 <w:rFonts w:ascii="Times New Roman" w:hAnsi="Times New Roman" w:cs="Times New Roman"/>
@@ -10146,22 +10509,24 @@
               </w:rPr>
               <w:t>reviewerId</w:t>
             </w:r>
-          </w:p>
-        </w:tc>
-        <w:tc>
-          <w:tcPr>
-            <w:tcW w:w="0" w:type="auto"/>
-            <w:vAlign w:val="center"/>
-            <w:hideMark/>
-          </w:tcPr>
-          <w:p>
-            <w:pPr>
-              <w:rPr>
-                <w:rFonts w:ascii="Times New Roman" w:hAnsi="Times New Roman" w:cs="Times New Roman"/>
-                <w:sz w:val="24"/>
-                <w:szCs w:val="24"/>
-              </w:rPr>
-            </w:pPr>
+            <w:proofErr w:type="spellEnd"/>
+          </w:p>
+        </w:tc>
+        <w:tc>
+          <w:tcPr>
+            <w:tcW w:w="0" w:type="auto"/>
+            <w:vAlign w:val="center"/>
+            <w:hideMark/>
+          </w:tcPr>
+          <w:p>
+            <w:pPr>
+              <w:rPr>
+                <w:rFonts w:ascii="Times New Roman" w:hAnsi="Times New Roman" w:cs="Times New Roman"/>
+                <w:sz w:val="24"/>
+                <w:szCs w:val="24"/>
+              </w:rPr>
+            </w:pPr>
+            <w:proofErr w:type="spellStart"/>
             <w:proofErr w:type="gramStart"/>
             <w:r>
               <w:rPr>
@@ -10169,7 +10534,16 @@
                 <w:sz w:val="24"/>
                 <w:szCs w:val="24"/>
               </w:rPr>
-              <w:t>ObjectId(</w:t>
+              <w:t>ObjectId</w:t>
+            </w:r>
+            <w:proofErr w:type="spellEnd"/>
+            <w:r>
+              <w:rPr>
+                <w:rFonts w:ascii="Times New Roman" w:hAnsi="Times New Roman" w:cs="Times New Roman"/>
+                <w:sz w:val="24"/>
+                <w:szCs w:val="24"/>
+              </w:rPr>
+              <w:t>(</w:t>
             </w:r>
             <w:proofErr w:type="gramEnd"/>
             <w:r>
@@ -10249,6 +10623,7 @@
                 <w:szCs w:val="24"/>
               </w:rPr>
             </w:pPr>
+            <w:proofErr w:type="spellStart"/>
             <w:r>
               <w:rPr>
                 <w:rFonts w:ascii="Times New Roman" w:hAnsi="Times New Roman" w:cs="Times New Roman"/>
@@ -10257,22 +10632,24 @@
               </w:rPr>
               <w:t>revieweeId</w:t>
             </w:r>
-          </w:p>
-        </w:tc>
-        <w:tc>
-          <w:tcPr>
-            <w:tcW w:w="0" w:type="auto"/>
-            <w:vAlign w:val="center"/>
-            <w:hideMark/>
-          </w:tcPr>
-          <w:p>
-            <w:pPr>
-              <w:rPr>
-                <w:rFonts w:ascii="Times New Roman" w:hAnsi="Times New Roman" w:cs="Times New Roman"/>
-                <w:sz w:val="24"/>
-                <w:szCs w:val="24"/>
-              </w:rPr>
-            </w:pPr>
+            <w:proofErr w:type="spellEnd"/>
+          </w:p>
+        </w:tc>
+        <w:tc>
+          <w:tcPr>
+            <w:tcW w:w="0" w:type="auto"/>
+            <w:vAlign w:val="center"/>
+            <w:hideMark/>
+          </w:tcPr>
+          <w:p>
+            <w:pPr>
+              <w:rPr>
+                <w:rFonts w:ascii="Times New Roman" w:hAnsi="Times New Roman" w:cs="Times New Roman"/>
+                <w:sz w:val="24"/>
+                <w:szCs w:val="24"/>
+              </w:rPr>
+            </w:pPr>
+            <w:proofErr w:type="spellStart"/>
             <w:proofErr w:type="gramStart"/>
             <w:r>
               <w:rPr>
@@ -10280,7 +10657,16 @@
                 <w:sz w:val="24"/>
                 <w:szCs w:val="24"/>
               </w:rPr>
-              <w:t>ObjectId(</w:t>
+              <w:t>ObjectId</w:t>
+            </w:r>
+            <w:proofErr w:type="spellEnd"/>
+            <w:r>
+              <w:rPr>
+                <w:rFonts w:ascii="Times New Roman" w:hAnsi="Times New Roman" w:cs="Times New Roman"/>
+                <w:sz w:val="24"/>
+                <w:szCs w:val="24"/>
+              </w:rPr>
+              <w:t>(</w:t>
             </w:r>
             <w:proofErr w:type="gramEnd"/>
             <w:r>
@@ -10562,6 +10948,7 @@
                 <w:szCs w:val="24"/>
               </w:rPr>
             </w:pPr>
+            <w:proofErr w:type="spellStart"/>
             <w:r>
               <w:rPr>
                 <w:rFonts w:ascii="Times New Roman" w:hAnsi="Times New Roman" w:cs="Times New Roman"/>
@@ -10570,6 +10957,7 @@
               </w:rPr>
               <w:t>createdAt</w:t>
             </w:r>
+            <w:proofErr w:type="spellEnd"/>
           </w:p>
         </w:tc>
         <w:tc>
@@ -10891,7 +11279,25 @@
           <w:sz w:val="24"/>
           <w:szCs w:val="24"/>
         </w:rPr>
-        <w:t>Matching Engine analyzes all listings</w:t>
+        <w:t xml:space="preserve">Matching Engine </w:t>
+      </w:r>
+      <w:proofErr w:type="spellStart"/>
+      <w:r>
+        <w:rPr>
+          <w:rFonts w:ascii="Times New Roman" w:hAnsi="Times New Roman" w:cs="Times New Roman"/>
+          <w:sz w:val="24"/>
+          <w:szCs w:val="24"/>
+        </w:rPr>
+        <w:t>analyzes</w:t>
+      </w:r>
+      <w:proofErr w:type="spellEnd"/>
+      <w:r>
+        <w:rPr>
+          <w:rFonts w:ascii="Times New Roman" w:hAnsi="Times New Roman" w:cs="Times New Roman"/>
+          <w:sz w:val="24"/>
+          <w:szCs w:val="24"/>
+        </w:rPr>
+        <w:t xml:space="preserve"> all listings</w:t>
       </w:r>
     </w:p>
     <w:p>
@@ -12503,7 +12909,6 @@
   <w:style w:type="character" w:default="1" w:styleId="DefaultParagraphFont">
     <w:name w:val="Default Paragraph Font"/>
     <w:uiPriority w:val="1"/>
-    <w:semiHidden/>
     <w:unhideWhenUsed/>
   </w:style>
   <w:style w:type="table" w:default="1" w:styleId="TableNormal">

</xml_diff>